<commit_message>
docs: real Apps Script response evidence for figure 10
</commit_message>
<xml_diff>
--- a/docs/informe-lab08.docx
+++ b/docs/informe-lab08.docx
@@ -2274,7 +2274,7 @@
       <w:r>
         <w:drawing>
           <wp:inline>
-            <wp:extent cx="5334000" cy="1622469"/>
+            <wp:extent cx="5334000" cy="1724121"/>
             <wp:effectExtent b="0" l="0" r="0" t="0"/>
             <wp:docPr descr="Figura 4 — Monitor Serie del ESP32-S3 (telemetría en claro)" title="" id="27" name="Picture"/>
             <a:graphic>
@@ -2295,7 +2295,7 @@
                   <pic:spPr bwMode="auto">
                     <a:xfrm>
                       <a:off x="0" y="0"/>
-                      <a:ext cx="5334000" cy="1622469"/>
+                      <a:ext cx="5334000" cy="1724121"/>
                     </a:xfrm>
                     <a:prstGeom prst="rect">
                       <a:avLst/>
@@ -2357,7 +2357,7 @@
       <w:r>
         <w:drawing>
           <wp:inline>
-            <wp:extent cx="5334000" cy="1622469"/>
+            <wp:extent cx="5334000" cy="3000375"/>
             <wp:effectExtent b="0" l="0" r="0" t="0"/>
             <wp:docPr descr="Figura 5 — MQTT Explorer con la telemetría base en claro" title="" id="30" name="Picture"/>
             <a:graphic>
@@ -2378,7 +2378,7 @@
                   <pic:spPr bwMode="auto">
                     <a:xfrm>
                       <a:off x="0" y="0"/>
-                      <a:ext cx="5334000" cy="1622469"/>
+                      <a:ext cx="5334000" cy="3000375"/>
                     </a:xfrm>
                     <a:prstGeom prst="rect">
                       <a:avLst/>
@@ -2495,7 +2495,7 @@
       <w:r>
         <w:drawing>
           <wp:inline>
-            <wp:extent cx="5334000" cy="1622469"/>
+            <wp:extent cx="5334000" cy="2692809"/>
             <wp:effectExtent b="0" l="0" r="0" t="0"/>
             <wp:docPr descr="Figura 6 — Lazo de actuación del relé" title="" id="33" name="Picture"/>
             <a:graphic>
@@ -2516,7 +2516,7 @@
                   <pic:spPr bwMode="auto">
                     <a:xfrm>
                       <a:off x="0" y="0"/>
-                      <a:ext cx="5334000" cy="1622469"/>
+                      <a:ext cx="5334000" cy="2692809"/>
                     </a:xfrm>
                     <a:prstGeom prst="rect">
                       <a:avLst/>
@@ -10807,7 +10807,7 @@
       <w:r>
         <w:drawing>
           <wp:inline>
-            <wp:extent cx="5334000" cy="1622469"/>
+            <wp:extent cx="5334000" cy="2667000"/>
             <wp:effectExtent b="0" l="0" r="0" t="0"/>
             <wp:docPr descr="Figura 9 — Hoja de cálculo con lecturas reales" title="" id="49" name="Picture"/>
             <a:graphic>
@@ -10828,7 +10828,7 @@
                   <pic:spPr bwMode="auto">
                     <a:xfrm>
                       <a:off x="0" y="0"/>
-                      <a:ext cx="5334000" cy="1622469"/>
+                      <a:ext cx="5334000" cy="2667000"/>
                     </a:xfrm>
                     <a:prstGeom prst="rect">
                       <a:avLst/>
@@ -10897,14 +10897,14 @@
       <w:r>
         <w:drawing>
           <wp:inline>
-            <wp:extent cx="5334000" cy="1622469"/>
+            <wp:extent cx="5334000" cy="1874654"/>
             <wp:effectExtent b="0" l="0" r="0" t="0"/>
-            <wp:docPr descr="Figura 10 — Respuesta JSON del Apps Script" title="" id="52" name="Picture"/>
+            <wp:docPr descr="Figura 10 — Respuesta del Apps Script confirmando la inserción" title="" id="52" name="Picture"/>
             <a:graphic>
               <a:graphicData uri="http://schemas.openxmlformats.org/drawingml/2006/picture">
                 <pic:pic>
                   <pic:nvPicPr>
-                    <pic:cNvPr descr="docs/img/10-apps-script-respuesta.png" id="53" name="Picture"/>
+                    <pic:cNvPr descr="docs/img/evidencia-apps-script-respuesta.png" id="53" name="Picture"/>
                     <pic:cNvPicPr>
                       <a:picLocks noChangeArrowheads="1" noChangeAspect="1"/>
                     </pic:cNvPicPr>
@@ -10918,7 +10918,7 @@
                   <pic:spPr bwMode="auto">
                     <a:xfrm>
                       <a:off x="0" y="0"/>
-                      <a:ext cx="5334000" cy="1622469"/>
+                      <a:ext cx="5334000" cy="1874654"/>
                     </a:xfrm>
                     <a:prstGeom prst="rect">
                       <a:avLst/>
@@ -10940,28 +10940,106 @@
         <w:t xml:space="preserve"> </w:t>
       </w:r>
       <w:r>
-        <w:t xml:space="preserve">&gt; Captura requerida: la respuesta del web app</w:t>
-      </w:r>
-      <w:r>
+        <w:rPr>
+          <w:i/>
+          <w:iCs/>
+        </w:rPr>
+        <w:t xml:space="preserve">Figura 10. Respuesta</w:t>
+      </w:r>
+      <w:r>
+        <w:rPr>
+          <w:i/>
+          <w:iCs/>
+        </w:rPr>
         <w:t xml:space="preserve"> </w:t>
       </w:r>
       <w:r>
         <w:rPr>
           <w:rStyle w:val="VerbatimChar"/>
-        </w:rPr>
-        <w:t xml:space="preserve">{"status":"ok","fila":N,"timestamp":"..."}</w:t>
-      </w:r>
-      <w:r>
-        <w:t xml:space="preserve"> </w:t>
-      </w:r>
-      <w:r>
-        <w:t xml:space="preserve">&gt; confirmando la inserción de una fila (visible, por ejemplo, en el panel Debug de Node-RED o</w:t>
-      </w:r>
-      <w:r>
-        <w:t xml:space="preserve"> </w:t>
-      </w:r>
-      <w:r>
-        <w:t xml:space="preserve">&gt; en las herramientas de red).</w:t>
+          <w:i/>
+          <w:iCs/>
+        </w:rPr>
+        <w:t xml:space="preserve">{"status":"ok","fila":N, ...}</w:t>
+      </w:r>
+      <w:r>
+        <w:rPr>
+          <w:i/>
+          <w:iCs/>
+        </w:rPr>
+        <w:t xml:space="preserve"> </w:t>
+      </w:r>
+      <w:r>
+        <w:rPr>
+          <w:i/>
+          <w:iCs/>
+        </w:rPr>
+        <w:t xml:space="preserve">del web app de Apps Script ante el POST de</w:t>
+      </w:r>
+      <w:r>
+        <w:rPr>
+          <w:i/>
+          <w:iCs/>
+        </w:rPr>
+        <w:t xml:space="preserve"> </w:t>
+      </w:r>
+      <w:r>
+        <w:rPr>
+          <w:i/>
+          <w:iCs/>
+        </w:rPr>
+        <w:t xml:space="preserve">Node-RED, confirmando que cada lectura descifrada se persiste como una</w:t>
+      </w:r>
+      <w:r>
+        <w:rPr>
+          <w:i/>
+          <w:iCs/>
+        </w:rPr>
+        <w:t xml:space="preserve"> </w:t>
+      </w:r>
+      <w:r>
+        <w:rPr>
+          <w:b/>
+          <w:bCs/>
+          <w:i/>
+          <w:iCs/>
+        </w:rPr>
+        <w:t xml:space="preserve">nueva fila</w:t>
+      </w:r>
+      <w:r>
+        <w:rPr>
+          <w:i/>
+          <w:iCs/>
+        </w:rPr>
+        <w:t xml:space="preserve"> </w:t>
+      </w:r>
+      <w:r>
+        <w:rPr>
+          <w:i/>
+          <w:iCs/>
+        </w:rPr>
+        <w:t xml:space="preserve">en la hoja</w:t>
+      </w:r>
+      <w:r>
+        <w:rPr>
+          <w:i/>
+          <w:iCs/>
+        </w:rPr>
+        <w:t xml:space="preserve"> </w:t>
+      </w:r>
+      <w:r>
+        <w:rPr>
+          <w:rStyle w:val="VerbatimChar"/>
+          <w:i/>
+          <w:iCs/>
+        </w:rPr>
+        <w:t xml:space="preserve">Datos_IoT_UNMSM_G1</w:t>
+      </w:r>
+      <w:r>
+        <w:rPr>
+          <w:i/>
+          <w:iCs/>
+        </w:rPr>
+        <w:t xml:space="preserve">.</w:t>
       </w:r>
     </w:p>
     <w:p>

</xml_diff>

<commit_message>
docs: regenerate report diagrams at 4x resolution
</commit_message>
<xml_diff>
--- a/docs/informe-lab08.docx
+++ b/docs/informe-lab08.docx
@@ -1740,7 +1740,7 @@
       <w:r>
         <w:drawing>
           <wp:inline>
-            <wp:extent cx="5334000" cy="2544535"/>
+            <wp:extent cx="5334000" cy="2524125"/>
             <wp:effectExtent b="0" l="0" r="0" t="0"/>
             <wp:docPr descr="Figura 2 — Diagrama de secuencia ECIES" title="" id="18" name="Picture"/>
             <a:graphic>
@@ -1761,7 +1761,7 @@
                   <pic:spPr bwMode="auto">
                     <a:xfrm>
                       <a:off x="0" y="0"/>
-                      <a:ext cx="5334000" cy="2544535"/>
+                      <a:ext cx="5334000" cy="2524125"/>
                     </a:xfrm>
                     <a:prstGeom prst="rect">
                       <a:avLst/>

</xml_diff>

<commit_message>
docs: add real runtime screenshots (serial, MQTT, LWT, Sheets) to Lab 08 report
</commit_message>
<xml_diff>
--- a/docs/informe-lab08.docx
+++ b/docs/informe-lab08.docx
@@ -65,7 +65,7 @@
     <w:bookmarkEnd w:id="9"/>
     <w:bookmarkEnd w:id="10"/>
     <w:bookmarkEnd w:id="11"/>
-    <w:bookmarkStart w:id="66" w:name="X7cca3b84612f5c2da6dae1b02920863dc46d37d"/>
+    <w:bookmarkStart w:id="69" w:name="X7cca3b84612f5c2da6dae1b02920863dc46d37d"/>
     <w:p>
       <w:pPr>
         <w:pStyle w:val="Heading1"/>
@@ -1946,7 +1946,7 @@
     </w:p>
     <w:bookmarkEnd w:id="21"/>
     <w:bookmarkEnd w:id="22"/>
-    <w:bookmarkStart w:id="35" w:name="actividades-13-verificación-base-mqtt"/>
+    <w:bookmarkStart w:id="38" w:name="actividades-13-verificación-base-mqtt"/>
     <w:p>
       <w:pPr>
         <w:pStyle w:val="Heading2"/>
@@ -2497,7 +2497,7 @@
           <wp:inline>
             <wp:extent cx="5334000" cy="2692809"/>
             <wp:effectExtent b="0" l="0" r="0" t="0"/>
-            <wp:docPr descr="Figura 6 — Lazo de actuación del relé" title="" id="33" name="Picture"/>
+            <wp:docPr descr="Figura 6a — LWT: el broker publica «offline» al caer el nodo" title="" id="33" name="Picture"/>
             <a:graphic>
               <a:graphicData uri="http://schemas.openxmlformats.org/drawingml/2006/picture">
                 <pic:pic>
@@ -2538,61 +2538,206 @@
         <w:t xml:space="preserve"> </w:t>
       </w:r>
       <w:r>
-        <w:t xml:space="preserve">&gt; Captura requerida: evidencia del relé conmutando ante una alarma de gas (mensaje en</w:t>
-      </w:r>
-      <w:r>
-        <w:t xml:space="preserve"> </w:t>
-      </w:r>
-      <w:r>
-        <w:t xml:space="preserve">&gt;</w:t>
-      </w:r>
-      <w:r>
+        <w:rPr>
+          <w:i/>
+          <w:iCs/>
+        </w:rPr>
+        <w:t xml:space="preserve">Figura 6a. Al desconectarse el ESP32, el broker detecta la pérdida de conexión y publica</w:t>
+      </w:r>
+      <w:r>
+        <w:rPr>
+          <w:i/>
+          <w:iCs/>
+        </w:rPr>
+        <w:t xml:space="preserve"> </w:t>
+      </w:r>
+      <w:r>
+        <w:rPr>
+          <w:i/>
+          <w:iCs/>
+        </w:rPr>
+        <w:t xml:space="preserve">automáticamente el mensaje</w:t>
+      </w:r>
+      <w:r>
+        <w:rPr>
+          <w:i/>
+          <w:iCs/>
+        </w:rPr>
+        <w:t xml:space="preserve"> </w:t>
+      </w:r>
+      <w:r>
+        <w:rPr>
+          <w:b/>
+          <w:bCs/>
+          <w:i/>
+          <w:iCs/>
+        </w:rPr>
+        <w:t xml:space="preserve">Last Will and Testament</w:t>
+      </w:r>
+      <w:r>
+        <w:rPr>
+          <w:i/>
+          <w:iCs/>
+        </w:rPr>
         <w:t xml:space="preserve"> </w:t>
       </w:r>
       <w:r>
         <w:rPr>
           <w:rStyle w:val="VerbatimChar"/>
-        </w:rPr>
-        <w:t xml:space="preserve">actuadores/relay</w:t>
-      </w:r>
-      <w:r>
-        <w:t xml:space="preserve">) y/o el cambio del tópico</w:t>
-      </w:r>
-      <w:r>
+          <w:i/>
+          <w:iCs/>
+        </w:rPr>
+        <w:t xml:space="preserve">offline</w:t>
+      </w:r>
+      <w:r>
+        <w:rPr>
+          <w:i/>
+          <w:iCs/>
+        </w:rPr>
+        <w:t xml:space="preserve"> </w:t>
+      </w:r>
+      <w:r>
+        <w:rPr>
+          <w:i/>
+          <w:iCs/>
+        </w:rPr>
+        <w:t xml:space="preserve">en el tópico</w:t>
+      </w:r>
+      <w:r>
+        <w:rPr>
+          <w:i/>
+          <w:iCs/>
+        </w:rPr>
         <w:t xml:space="preserve"> </w:t>
       </w:r>
       <w:r>
         <w:rPr>
           <w:rStyle w:val="VerbatimChar"/>
+          <w:i/>
+          <w:iCs/>
         </w:rPr>
         <w:t xml:space="preserve">status</w:t>
       </w:r>
       <w:r>
-        <w:t xml:space="preserve"> </w:t>
-      </w:r>
-      <w:r>
-        <w:t xml:space="preserve">a</w:t>
-      </w:r>
-      <w:r>
+        <w:rPr>
+          <w:i/>
+          <w:iCs/>
+        </w:rPr>
+        <w:t xml:space="preserve">, sin</w:t>
+      </w:r>
+      <w:r>
+        <w:rPr>
+          <w:i/>
+          <w:iCs/>
+        </w:rPr>
+        <w:t xml:space="preserve"> </w:t>
+      </w:r>
+      <w:r>
+        <w:rPr>
+          <w:i/>
+          <w:iCs/>
+        </w:rPr>
+        <w:t xml:space="preserve">intervención del dispositivo.</w:t>
+      </w:r>
+    </w:p>
+    <w:p>
+      <w:pPr>
+        <w:pStyle w:val="BodyText"/>
+      </w:pPr>
+      <w:r>
+        <w:drawing>
+          <wp:inline>
+            <wp:extent cx="5334000" cy="2953560"/>
+            <wp:effectExtent b="0" l="0" r="0" t="0"/>
+            <wp:docPr descr="Figura 6b — El nodo vuelve a «online» al reconectarse" title="" id="36" name="Picture"/>
+            <a:graphic>
+              <a:graphicData uri="http://schemas.openxmlformats.org/drawingml/2006/picture">
+                <pic:pic>
+                  <pic:nvPicPr>
+                    <pic:cNvPr descr="docs/img/06-relay-lwt-online.png" id="37" name="Picture"/>
+                    <pic:cNvPicPr>
+                      <a:picLocks noChangeArrowheads="1" noChangeAspect="1"/>
+                    </pic:cNvPicPr>
+                  </pic:nvPicPr>
+                  <pic:blipFill>
+                    <a:blip r:embed="rId35"/>
+                    <a:stretch>
+                      <a:fillRect/>
+                    </a:stretch>
+                  </pic:blipFill>
+                  <pic:spPr bwMode="auto">
+                    <a:xfrm>
+                      <a:off x="0" y="0"/>
+                      <a:ext cx="5334000" cy="2953560"/>
+                    </a:xfrm>
+                    <a:prstGeom prst="rect">
+                      <a:avLst/>
+                    </a:prstGeom>
+                    <a:noFill/>
+                    <a:ln w="9525">
+                      <a:noFill/>
+                      <a:headEnd/>
+                      <a:tailEnd/>
+                    </a:ln>
+                  </pic:spPr>
+                </pic:pic>
+              </a:graphicData>
+            </a:graphic>
+          </wp:inline>
+        </w:drawing>
+      </w:r>
+      <w:r>
+        <w:t xml:space="preserve"> </w:t>
+      </w:r>
+      <w:r>
+        <w:rPr>
+          <w:i/>
+          <w:iCs/>
+        </w:rPr>
+        <w:t xml:space="preserve">Figura 6b. Cuando el ESP32 se reconecta al broker, publica</w:t>
+      </w:r>
+      <w:r>
+        <w:rPr>
+          <w:i/>
+          <w:iCs/>
+        </w:rPr>
         <w:t xml:space="preserve"> </w:t>
       </w:r>
       <w:r>
         <w:rPr>
           <w:rStyle w:val="VerbatimChar"/>
-        </w:rPr>
-        <w:t xml:space="preserve">offline</w:t>
-      </w:r>
-      <w:r>
-        <w:t xml:space="preserve"> </w:t>
-      </w:r>
-      <w:r>
-        <w:t xml:space="preserve">por acción del LWT al</w:t>
-      </w:r>
-      <w:r>
-        <w:t xml:space="preserve"> </w:t>
-      </w:r>
-      <w:r>
-        <w:t xml:space="preserve">&gt; desconectar el nodo.</w:t>
+          <w:i/>
+          <w:iCs/>
+        </w:rPr>
+        <w:t xml:space="preserve">online</w:t>
+      </w:r>
+      <w:r>
+        <w:rPr>
+          <w:i/>
+          <w:iCs/>
+        </w:rPr>
+        <w:t xml:space="preserve"> </w:t>
+      </w:r>
+      <w:r>
+        <w:rPr>
+          <w:i/>
+          <w:iCs/>
+        </w:rPr>
+        <w:t xml:space="preserve">(retenido) en el mismo</w:t>
+      </w:r>
+      <w:r>
+        <w:rPr>
+          <w:i/>
+          <w:iCs/>
+        </w:rPr>
+        <w:t xml:space="preserve"> </w:t>
+      </w:r>
+      <w:r>
+        <w:rPr>
+          <w:i/>
+          <w:iCs/>
+        </w:rPr>
+        <w:t xml:space="preserve">tópico, restableciendo la señalización de presencia del nodo.</w:t>
       </w:r>
     </w:p>
     <w:p>
@@ -2602,8 +2747,8 @@
         </w:pict>
       </w:r>
     </w:p>
-    <w:bookmarkEnd w:id="35"/>
-    <w:bookmarkStart w:id="46" w:name="actividad-4-cifrado-ecc-ecies"/>
+    <w:bookmarkEnd w:id="38"/>
+    <w:bookmarkStart w:id="49" w:name="actividad-4-cifrado-ecc-ecies"/>
     <w:p>
       <w:pPr>
         <w:pStyle w:val="Heading2"/>
@@ -2740,7 +2885,7 @@
         <w:t xml:space="preserve">16 B y el texto cifrado. A continuación se incrustan las primitivas reales del firmware.</w:t>
       </w:r>
     </w:p>
-    <w:bookmarkStart w:id="36" w:name="Xf46fb2ddc468c09afaf0dfaabc60ab4fbb6f7a8"/>
+    <w:bookmarkStart w:id="39" w:name="Xf46fb2ddc468c09afaf0dfaabc60ab4fbb6f7a8"/>
     <w:p>
       <w:pPr>
         <w:pStyle w:val="Heading3"/>
@@ -3363,8 +3508,8 @@
         <w:t xml:space="preserve">}</w:t>
       </w:r>
     </w:p>
-    <w:bookmarkEnd w:id="36"/>
-    <w:bookmarkStart w:id="37" w:name="X0b282f6759866ce78785e53969cacde3a40110a"/>
+    <w:bookmarkEnd w:id="39"/>
+    <w:bookmarkStart w:id="40" w:name="X0b282f6759866ce78785e53969cacde3a40110a"/>
     <w:p>
       <w:pPr>
         <w:pStyle w:val="Heading3"/>
@@ -4136,8 +4281,8 @@
         <w:t xml:space="preserve">}</w:t>
       </w:r>
     </w:p>
-    <w:bookmarkEnd w:id="37"/>
-    <w:bookmarkStart w:id="38" w:name="cifrado-ecies-completo-publisher-ecc.ino"/>
+    <w:bookmarkEnd w:id="40"/>
+    <w:bookmarkStart w:id="41" w:name="cifrado-ecies-completo-publisher-ecc.ino"/>
     <w:p>
       <w:pPr>
         <w:pStyle w:val="Heading3"/>
@@ -5734,8 +5879,8 @@
         <w:t xml:space="preserve">.</w:t>
       </w:r>
     </w:p>
-    <w:bookmarkEnd w:id="38"/>
-    <w:bookmarkStart w:id="45" w:name="Xf14e9f1350fea50eafad4c5f61c7e996eea92a8"/>
+    <w:bookmarkEnd w:id="41"/>
+    <w:bookmarkStart w:id="48" w:name="Xf14e9f1350fea50eafad4c5f61c7e996eea92a8"/>
     <w:p>
       <w:pPr>
         <w:pStyle w:val="Heading3"/>
@@ -8092,18 +8237,18 @@
           <wp:inline>
             <wp:extent cx="5334000" cy="1730101"/>
             <wp:effectExtent b="0" l="0" r="0" t="0"/>
-            <wp:docPr descr="Figura 7 — Ciphertext Base64 en el broker" title="" id="40" name="Picture"/>
+            <wp:docPr descr="Figura 7 — Ciphertext Base64 en el broker" title="" id="43" name="Picture"/>
             <a:graphic>
               <a:graphicData uri="http://schemas.openxmlformats.org/drawingml/2006/picture">
                 <pic:pic>
                   <pic:nvPicPr>
-                    <pic:cNvPr descr="docs/img/evidencia-ciphertext-broker.png" id="41" name="Picture"/>
+                    <pic:cNvPr descr="docs/img/evidencia-ciphertext-broker.png" id="44" name="Picture"/>
                     <pic:cNvPicPr>
                       <a:picLocks noChangeArrowheads="1" noChangeAspect="1"/>
                     </pic:cNvPicPr>
                   </pic:nvPicPr>
                   <pic:blipFill>
-                    <a:blip r:embed="rId39"/>
+                    <a:blip r:embed="rId42"/>
                     <a:stretch>
                       <a:fillRect/>
                     </a:stretch>
@@ -8229,18 +8374,18 @@
           <wp:inline>
             <wp:extent cx="5334000" cy="2154882"/>
             <wp:effectExtent b="0" l="0" r="0" t="0"/>
-            <wp:docPr descr="Figura 8 — JSON descifrado por Node-RED" title="" id="43" name="Picture"/>
+            <wp:docPr descr="Figura 8 — JSON descifrado por Node-RED" title="" id="46" name="Picture"/>
             <a:graphic>
               <a:graphicData uri="http://schemas.openxmlformats.org/drawingml/2006/picture">
                 <pic:pic>
                   <pic:nvPicPr>
-                    <pic:cNvPr descr="docs/img/evidencia-json-descifrado.png" id="44" name="Picture"/>
+                    <pic:cNvPr descr="docs/img/evidencia-json-descifrado.png" id="47" name="Picture"/>
                     <pic:cNvPicPr>
                       <a:picLocks noChangeArrowheads="1" noChangeAspect="1"/>
                     </pic:cNvPicPr>
                   </pic:nvPicPr>
                   <pic:blipFill>
-                    <a:blip r:embed="rId42"/>
+                    <a:blip r:embed="rId45"/>
                     <a:stretch>
                       <a:fillRect/>
                     </a:stretch>
@@ -8459,9 +8604,9 @@
         </w:pict>
       </w:r>
     </w:p>
-    <w:bookmarkEnd w:id="45"/>
-    <w:bookmarkEnd w:id="46"/>
-    <w:bookmarkStart w:id="55" w:name="X2da9ff53cdeba479bf1591976f9ebdf1bc8c9c7"/>
+    <w:bookmarkEnd w:id="48"/>
+    <w:bookmarkEnd w:id="49"/>
+    <w:bookmarkStart w:id="58" w:name="X2da9ff53cdeba479bf1591976f9ebdf1bc8c9c7"/>
     <w:p>
       <w:pPr>
         <w:pStyle w:val="Heading2"/>
@@ -8556,7 +8701,7 @@
         <w:t xml:space="preserve">persiste cada lectura.</w:t>
       </w:r>
     </w:p>
-    <w:bookmarkStart w:id="47" w:name="endpoint-dopost-apps-scriptcodigo.gs"/>
+    <w:bookmarkStart w:id="50" w:name="endpoint-dopost-apps-scriptcodigo.gs"/>
     <w:p>
       <w:pPr>
         <w:pStyle w:val="Heading3"/>
@@ -10388,8 +10533,8 @@
         <w:t xml:space="preserve">}</w:t>
       </w:r>
     </w:p>
-    <w:bookmarkEnd w:id="47"/>
-    <w:bookmarkStart w:id="54" w:name="mapeo-de-columnas"/>
+    <w:bookmarkEnd w:id="50"/>
+    <w:bookmarkStart w:id="57" w:name="mapeo-de-columnas"/>
     <w:p>
       <w:pPr>
         <w:pStyle w:val="Heading3"/>
@@ -10809,18 +10954,18 @@
           <wp:inline>
             <wp:extent cx="5334000" cy="2667000"/>
             <wp:effectExtent b="0" l="0" r="0" t="0"/>
-            <wp:docPr descr="Figura 9 — Hoja de cálculo con lecturas reales" title="" id="49" name="Picture"/>
+            <wp:docPr descr="Figura 9 — Hoja de cálculo con lecturas reales" title="" id="52" name="Picture"/>
             <a:graphic>
               <a:graphicData uri="http://schemas.openxmlformats.org/drawingml/2006/picture">
                 <pic:pic>
                   <pic:nvPicPr>
-                    <pic:cNvPr descr="docs/img/09-google-sheets-filas.png" id="50" name="Picture"/>
+                    <pic:cNvPr descr="docs/img/09-google-sheets-filas.png" id="53" name="Picture"/>
                     <pic:cNvPicPr>
                       <a:picLocks noChangeArrowheads="1" noChangeAspect="1"/>
                     </pic:cNvPicPr>
                   </pic:nvPicPr>
                   <pic:blipFill>
-                    <a:blip r:embed="rId48"/>
+                    <a:blip r:embed="rId51"/>
                     <a:stretch>
                       <a:fillRect/>
                     </a:stretch>
@@ -10899,18 +11044,18 @@
           <wp:inline>
             <wp:extent cx="5334000" cy="1874654"/>
             <wp:effectExtent b="0" l="0" r="0" t="0"/>
-            <wp:docPr descr="Figura 10 — Respuesta del Apps Script confirmando la inserción" title="" id="52" name="Picture"/>
+            <wp:docPr descr="Figura 10 — Respuesta del Apps Script confirmando la inserción" title="" id="55" name="Picture"/>
             <a:graphic>
               <a:graphicData uri="http://schemas.openxmlformats.org/drawingml/2006/picture">
                 <pic:pic>
                   <pic:nvPicPr>
-                    <pic:cNvPr descr="docs/img/evidencia-apps-script-respuesta.png" id="53" name="Picture"/>
+                    <pic:cNvPr descr="docs/img/evidencia-apps-script-respuesta.png" id="56" name="Picture"/>
                     <pic:cNvPicPr>
                       <a:picLocks noChangeArrowheads="1" noChangeAspect="1"/>
                     </pic:cNvPicPr>
                   </pic:nvPicPr>
                   <pic:blipFill>
-                    <a:blip r:embed="rId51"/>
+                    <a:blip r:embed="rId54"/>
                     <a:stretch>
                       <a:fillRect/>
                     </a:stretch>
@@ -11049,9 +11194,9 @@
         </w:pict>
       </w:r>
     </w:p>
-    <w:bookmarkEnd w:id="54"/>
-    <w:bookmarkEnd w:id="55"/>
-    <w:bookmarkStart w:id="63" w:name="cuestionario"/>
+    <w:bookmarkEnd w:id="57"/>
+    <w:bookmarkEnd w:id="58"/>
+    <w:bookmarkStart w:id="66" w:name="cuestionario"/>
     <w:p>
       <w:pPr>
         <w:pStyle w:val="Heading2"/>
@@ -11060,7 +11205,7 @@
         <w:t xml:space="preserve">6. Cuestionario</w:t>
       </w:r>
     </w:p>
-    <w:bookmarkStart w:id="56" w:name="mqtt"/>
+    <w:bookmarkStart w:id="59" w:name="mqtt"/>
     <w:p>
       <w:pPr>
         <w:pStyle w:val="Heading3"/>
@@ -11756,8 +11901,8 @@
         <w:t xml:space="preserve">mera presencia/ausencia del nodo fuese información confidencial se justificaría protegerlo.</w:t>
       </w:r>
     </w:p>
-    <w:bookmarkEnd w:id="56"/>
-    <w:bookmarkStart w:id="57" w:name="seguridad-ecc"/>
+    <w:bookmarkEnd w:id="59"/>
+    <w:bookmarkStart w:id="60" w:name="seguridad-ecc"/>
     <w:p>
       <w:pPr>
         <w:pStyle w:val="Heading3"/>
@@ -12852,8 +12997,8 @@
         <w:t xml:space="preserve">del mensaje, que para estos JSON ronda los ~370–400 B.</w:t>
       </w:r>
     </w:p>
-    <w:bookmarkEnd w:id="57"/>
-    <w:bookmarkStart w:id="58" w:name="google-sheets"/>
+    <w:bookmarkEnd w:id="60"/>
+    <w:bookmarkStart w:id="61" w:name="google-sheets"/>
     <w:p>
       <w:pPr>
         <w:pStyle w:val="Heading3"/>
@@ -13414,8 +13559,8 @@
         <w:t xml:space="preserve">tiempo de ejecución.</w:t>
       </w:r>
     </w:p>
-    <w:bookmarkEnd w:id="58"/>
-    <w:bookmarkStart w:id="62" w:name="diseño-integral-grupal"/>
+    <w:bookmarkEnd w:id="61"/>
+    <w:bookmarkStart w:id="65" w:name="diseño-integral-grupal"/>
     <w:p>
       <w:pPr>
         <w:pStyle w:val="Heading3"/>
@@ -13893,18 +14038,18 @@
           <wp:inline>
             <wp:extent cx="5334000" cy="3320142"/>
             <wp:effectExtent b="0" l="0" r="0" t="0"/>
-            <wp:docPr descr="Figura 11 — Arquitectura propuesta para 5 aulas" title="" id="60" name="Picture"/>
+            <wp:docPr descr="Figura 11 — Arquitectura propuesta para 5 aulas" title="" id="63" name="Picture"/>
             <a:graphic>
               <a:graphicData uri="http://schemas.openxmlformats.org/drawingml/2006/picture">
                 <pic:pic>
                   <pic:nvPicPr>
-                    <pic:cNvPr descr="docs/img/diseno-5-aulas.png" id="61" name="Picture"/>
+                    <pic:cNvPr descr="docs/img/diseno-5-aulas.png" id="64" name="Picture"/>
                     <pic:cNvPicPr>
                       <a:picLocks noChangeArrowheads="1" noChangeAspect="1"/>
                     </pic:cNvPicPr>
                   </pic:nvPicPr>
                   <pic:blipFill>
-                    <a:blip r:embed="rId59"/>
+                    <a:blip r:embed="rId62"/>
                     <a:stretch>
                       <a:fillRect/>
                     </a:stretch>
@@ -13962,9 +14107,9 @@
         </w:pict>
       </w:r>
     </w:p>
-    <w:bookmarkEnd w:id="62"/>
-    <w:bookmarkEnd w:id="63"/>
-    <w:bookmarkStart w:id="64" w:name="conclusiones"/>
+    <w:bookmarkEnd w:id="65"/>
+    <w:bookmarkEnd w:id="66"/>
+    <w:bookmarkStart w:id="67" w:name="conclusiones"/>
     <w:p>
       <w:pPr>
         <w:pStyle w:val="Heading2"/>
@@ -14301,8 +14446,8 @@
         </w:pict>
       </w:r>
     </w:p>
-    <w:bookmarkEnd w:id="64"/>
-    <w:bookmarkStart w:id="65" w:name="referencias"/>
+    <w:bookmarkEnd w:id="67"/>
+    <w:bookmarkStart w:id="68" w:name="referencias"/>
     <w:p>
       <w:pPr>
         <w:pStyle w:val="Heading2"/>
@@ -14506,8 +14651,8 @@
         <w:t xml:space="preserve">[Software]. GitHub. https://github.com/kmackay/micro-ecc</w:t>
       </w:r>
     </w:p>
-    <w:bookmarkEnd w:id="65"/>
-    <w:bookmarkEnd w:id="66"/>
+    <w:bookmarkEnd w:id="68"/>
+    <w:bookmarkEnd w:id="69"/>
     <w:sectPr>
       <w:footnotePr>
         <w:numRestart w:val="eachSect"/>

</xml_diff>

<commit_message>
docs: black headings, no TOC, members, separators removed, vertical architecture diagram
</commit_message>
<xml_diff>
--- a/docs/informe-lab08.docx
+++ b/docs/informe-lab08.docx
@@ -2,32 +2,6 @@
 <file path=word/document.xml><?xml version="1.0" encoding="utf-8"?>
 <w:document xmlns:w="http://schemas.openxmlformats.org/wordprocessingml/2006/main" xmlns:m="http://schemas.openxmlformats.org/officeDocument/2006/math" xmlns:r="http://schemas.openxmlformats.org/officeDocument/2006/relationships" xmlns:o="urn:schemas-microsoft-com:office:office" xmlns:v="urn:schemas-microsoft-com:vml" xmlns:w10="urn:schemas-microsoft-com:office:word" xmlns:a="http://schemas.openxmlformats.org/drawingml/2006/main" xmlns:pic="http://schemas.openxmlformats.org/drawingml/2006/picture" xmlns:wp="http://schemas.openxmlformats.org/drawingml/2006/wordprocessingDrawing">
   <w:body>
-    <w:sdt>
-      <w:sdtPr>
-        <w:docPartObj>
-          <w:docPartGallery w:val="Table of Contents"/>
-          <w:docPartUnique/>
-        </w:docPartObj>
-      </w:sdtPr>
-      <w:sdtContent>
-        <w:p>
-          <w:pPr>
-            <w:pStyle w:val="TOCHeading"/>
-          </w:pPr>
-          <w:r>
-            <w:t xml:space="preserve">Table of Contents</w:t>
-          </w:r>
-        </w:p>
-        <w:p>
-          <w:r>
-            <w:fldChar w:fldCharType="begin" w:dirty="true"/>
-            <w:instrText xml:space="preserve">TOC \o "1-2" \h \z \u</w:instrText>
-            <w:fldChar w:fldCharType="separate"/>
-            <w:fldChar w:fldCharType="end"/>
-          </w:r>
-        </w:p>
-      </w:sdtContent>
-    </w:sdt>
     <w:bookmarkStart w:id="11" w:name="universidad-nacional-mayor-de-san-marcos"/>
     <w:p>
       <w:pPr>
@@ -53,13 +27,6 @@
       </w:pPr>
       <w:r>
         <w:t xml:space="preserve">Curso: Internet de las Cosas</w:t>
-      </w:r>
-    </w:p>
-    <w:p>
-      <w:r>
-        <w:pict>
-          <v:rect style="width:0;height:1.5pt" o:hralign="center" o:hrstd="t" o:hr="t"/>
-        </w:pict>
       </w:r>
     </w:p>
     <w:bookmarkEnd w:id="9"/>
@@ -107,11 +74,7 @@
               <w:pStyle w:val="Compact"/>
             </w:pPr>
             <w:r>
-              <w:rPr>
-                <w:i/>
-                <w:iCs/>
-              </w:rPr>
-              <w:t xml:space="preserve">[completar — apellidos y nombres, código]</w:t>
+              <w:t xml:space="preserve">Pumapillo Sarmiento, Bruno</w:t>
             </w:r>
           </w:p>
         </w:tc>
@@ -132,11 +95,7 @@
               <w:pStyle w:val="Compact"/>
             </w:pPr>
             <w:r>
-              <w:rPr>
-                <w:i/>
-                <w:iCs/>
-              </w:rPr>
-              <w:t xml:space="preserve">[completar]</w:t>
+              <w:t xml:space="preserve">Sota Rios, Pedro Josue</w:t>
             </w:r>
           </w:p>
         </w:tc>
@@ -157,11 +116,28 @@
               <w:pStyle w:val="Compact"/>
             </w:pPr>
             <w:r>
-              <w:rPr>
-                <w:i/>
-                <w:iCs/>
-              </w:rPr>
-              <w:t xml:space="preserve">[completar]</w:t>
+              <w:t xml:space="preserve">Quineche Casana, Luiz Ignacio</w:t>
+            </w:r>
+          </w:p>
+        </w:tc>
+      </w:tr>
+      <w:tr>
+        <w:tc>
+          <w:tcPr/>
+          <w:p>
+            <w:pPr>
+              <w:pStyle w:val="Compact"/>
+            </w:pPr>
+          </w:p>
+        </w:tc>
+        <w:tc>
+          <w:tcPr/>
+          <w:p>
+            <w:pPr>
+              <w:pStyle w:val="Compact"/>
+            </w:pPr>
+            <w:r>
+              <w:t xml:space="preserve">Davalos Benito, Rodrigo</w:t>
             </w:r>
           </w:p>
         </w:tc>
@@ -255,13 +231,6 @@
         </w:tc>
       </w:tr>
     </w:tbl>
-    <w:p>
-      <w:r>
-        <w:pict>
-          <v:rect style="width:0;height:1.5pt" o:hralign="center" o:hrstd="t" o:hr="t"/>
-        </w:pict>
-      </w:r>
-    </w:p>
     <w:bookmarkStart w:id="12" w:name="introducción"/>
     <w:p>
       <w:pPr>
@@ -568,13 +537,6 @@
       </w:r>
       <w:r>
         <w:t xml:space="preserve">servicios gratuitos de la nube para obtener un sistema IoT seguro, observable y reproducible.</w:t>
-      </w:r>
-    </w:p>
-    <w:p>
-      <w:r>
-        <w:pict>
-          <v:rect style="width:0;height:1.5pt" o:hralign="center" o:hrstd="t" o:hr="t"/>
-        </w:pict>
       </w:r>
     </w:p>
     <w:bookmarkEnd w:id="12"/>
@@ -1655,7 +1617,7 @@
       <w:r>
         <w:drawing>
           <wp:inline>
-            <wp:extent cx="5334000" cy="673553"/>
+            <wp:extent cx="5334000" cy="7045249"/>
             <wp:effectExtent b="0" l="0" r="0" t="0"/>
             <wp:docPr descr="Figura 1 — Arquitectura del sistema (extremo a extremo)" title="" id="15" name="Picture"/>
             <a:graphic>
@@ -1676,7 +1638,7 @@
                   <pic:spPr bwMode="auto">
                     <a:xfrm>
                       <a:off x="0" y="0"/>
-                      <a:ext cx="5334000" cy="673553"/>
+                      <a:ext cx="5334000" cy="7045249"/>
                     </a:xfrm>
                     <a:prstGeom prst="rect">
                       <a:avLst/>
@@ -1937,13 +1899,6 @@
         <w:t xml:space="preserve">adecuado para prototipos y laboratorios.</w:t>
       </w:r>
     </w:p>
-    <w:p>
-      <w:r>
-        <w:pict>
-          <v:rect style="width:0;height:1.5pt" o:hralign="center" o:hrstd="t" o:hr="t"/>
-        </w:pict>
-      </w:r>
-    </w:p>
     <w:bookmarkEnd w:id="21"/>
     <w:bookmarkEnd w:id="22"/>
     <w:bookmarkStart w:id="38" w:name="actividades-13-verificación-base-mqtt"/>
@@ -2740,13 +2695,6 @@
         <w:t xml:space="preserve">tópico, restableciendo la señalización de presencia del nodo.</w:t>
       </w:r>
     </w:p>
-    <w:p>
-      <w:r>
-        <w:pict>
-          <v:rect style="width:0;height:1.5pt" o:hralign="center" o:hrstd="t" o:hr="t"/>
-        </w:pict>
-      </w:r>
-    </w:p>
     <w:bookmarkEnd w:id="38"/>
     <w:bookmarkStart w:id="49" w:name="actividad-4-cifrado-ecc-ecies"/>
     <w:p>
@@ -8595,13 +8543,6 @@
           <w:iCs/>
         </w:rPr>
         <w:t xml:space="preserve">.</w:t>
-      </w:r>
-    </w:p>
-    <w:p>
-      <w:r>
-        <w:pict>
-          <v:rect style="width:0;height:1.5pt" o:hralign="center" o:hrstd="t" o:hr="t"/>
-        </w:pict>
       </w:r>
     </w:p>
     <w:bookmarkEnd w:id="48"/>
@@ -11187,13 +11128,6 @@
         <w:t xml:space="preserve">.</w:t>
       </w:r>
     </w:p>
-    <w:p>
-      <w:r>
-        <w:pict>
-          <v:rect style="width:0;height:1.5pt" o:hralign="center" o:hrstd="t" o:hr="t"/>
-        </w:pict>
-      </w:r>
-    </w:p>
     <w:bookmarkEnd w:id="57"/>
     <w:bookmarkEnd w:id="58"/>
     <w:bookmarkStart w:id="66" w:name="cuestionario"/>
@@ -14100,13 +14034,6 @@
         <w:t xml:space="preserve">ACL, descifrado y validación en Node-RED, persistencia por pestaña y alertas por correo.</w:t>
       </w:r>
     </w:p>
-    <w:p>
-      <w:r>
-        <w:pict>
-          <v:rect style="width:0;height:1.5pt" o:hralign="center" o:hrstd="t" o:hr="t"/>
-        </w:pict>
-      </w:r>
-    </w:p>
     <w:bookmarkEnd w:id="65"/>
     <w:bookmarkEnd w:id="66"/>
     <w:bookmarkStart w:id="67" w:name="conclusiones"/>
@@ -14437,13 +14364,6 @@
       </w:r>
       <w:r>
         <w:t xml:space="preserve">reduce la superficie de ataque: interceptar la red no basta para descifrar.</w:t>
-      </w:r>
-    </w:p>
-    <w:p>
-      <w:r>
-        <w:pict>
-          <v:rect style="width:0;height:1.5pt" o:hralign="center" o:hrstd="t" o:hr="t"/>
-        </w:pict>
       </w:r>
     </w:p>
     <w:bookmarkEnd w:id="67"/>
@@ -15146,7 +15066,7 @@
     <w:rsid w:val="00A10FD9"/>
     <w:rPr>
       <w:rFonts w:cstheme="majorBidi" w:eastAsiaTheme="majorEastAsia"/>
-      <w:color w:themeColor="text1" w:themeTint="A6" w:val="595959"/>
+      <w:color w:themeColor="text1" w:themeTint="A6" w:val="000000"/>
       <w:spacing w:val="15"/>
       <w:sz w:val="28"/>
       <w:szCs w:val="28"/>
@@ -15236,7 +15156,7 @@
     </w:pPr>
     <w:rPr>
       <w:rFonts w:asciiTheme="majorHAnsi" w:cstheme="majorBidi" w:eastAsiaTheme="majorEastAsia" w:hAnsiTheme="majorHAnsi"/>
-      <w:color w:themeColor="accent1" w:themeShade="BF" w:val="0F4761"/>
+      <w:color w:themeColor="accent1" w:themeShade="BF" w:val="000000"/>
       <w:sz w:val="40"/>
       <w:szCs w:val="40"/>
     </w:rPr>
@@ -15259,7 +15179,7 @@
     </w:pPr>
     <w:rPr>
       <w:rFonts w:asciiTheme="majorHAnsi" w:cstheme="majorBidi" w:eastAsiaTheme="majorEastAsia" w:hAnsiTheme="majorHAnsi"/>
-      <w:color w:themeColor="accent1" w:themeShade="BF" w:val="0F4761"/>
+      <w:color w:themeColor="accent1" w:themeShade="BF" w:val="000000"/>
       <w:sz w:val="32"/>
       <w:szCs w:val="32"/>
     </w:rPr>
@@ -15282,7 +15202,7 @@
     </w:pPr>
     <w:rPr>
       <w:rFonts w:cstheme="majorBidi" w:eastAsiaTheme="majorEastAsia"/>
-      <w:color w:themeColor="accent1" w:themeShade="BF" w:val="0F4761"/>
+      <w:color w:themeColor="accent1" w:themeShade="BF" w:val="000000"/>
       <w:sz w:val="28"/>
       <w:szCs w:val="28"/>
     </w:rPr>
@@ -15307,7 +15227,7 @@
       <w:rFonts w:cstheme="majorBidi" w:eastAsiaTheme="majorEastAsia"/>
       <w:i/>
       <w:iCs/>
-      <w:color w:themeColor="accent1" w:themeShade="BF" w:val="0F4761"/>
+      <w:color w:themeColor="accent1" w:themeShade="BF" w:val="000000"/>
     </w:rPr>
   </w:style>
   <w:style w:styleId="Heading5" w:type="paragraph">
@@ -15328,7 +15248,7 @@
     </w:pPr>
     <w:rPr>
       <w:rFonts w:cstheme="majorBidi" w:eastAsiaTheme="majorEastAsia"/>
-      <w:color w:themeColor="accent1" w:themeShade="BF" w:val="0F4761"/>
+      <w:color w:themeColor="accent1" w:themeShade="BF" w:val="000000"/>
     </w:rPr>
   </w:style>
   <w:style w:styleId="Heading6" w:type="paragraph">
@@ -15351,7 +15271,7 @@
       <w:rFonts w:cstheme="majorBidi" w:eastAsiaTheme="majorEastAsia"/>
       <w:i/>
       <w:iCs/>
-      <w:color w:themeColor="text1" w:themeTint="A6" w:val="595959"/>
+      <w:color w:themeColor="text1" w:themeTint="A6" w:val="000000"/>
     </w:rPr>
   </w:style>
   <w:style w:styleId="Heading7" w:type="paragraph">
@@ -15372,7 +15292,7 @@
     </w:pPr>
     <w:rPr>
       <w:rFonts w:cstheme="majorBidi" w:eastAsiaTheme="majorEastAsia"/>
-      <w:color w:themeColor="text1" w:themeTint="A6" w:val="595959"/>
+      <w:color w:themeColor="text1" w:themeTint="A6" w:val="000000"/>
     </w:rPr>
   </w:style>
   <w:style w:styleId="Heading8" w:type="paragraph">
@@ -15395,7 +15315,7 @@
       <w:rFonts w:cstheme="majorBidi" w:eastAsiaTheme="majorEastAsia"/>
       <w:i/>
       <w:iCs/>
-      <w:color w:themeColor="text1" w:themeTint="D8" w:val="272727"/>
+      <w:color w:themeColor="text1" w:themeTint="D8" w:val="000000"/>
     </w:rPr>
   </w:style>
   <w:style w:styleId="Heading9" w:type="paragraph">
@@ -15416,7 +15336,7 @@
     </w:pPr>
     <w:rPr>
       <w:rFonts w:cstheme="majorBidi" w:eastAsiaTheme="majorEastAsia"/>
-      <w:color w:themeColor="text1" w:themeTint="D8" w:val="272727"/>
+      <w:color w:themeColor="text1" w:themeTint="D8" w:val="000000"/>
     </w:rPr>
   </w:style>
   <w:style w:customStyle="1" w:styleId="Heading1Char" w:type="character">
@@ -15427,7 +15347,7 @@
     <w:rsid w:val="00A10FD9"/>
     <w:rPr>
       <w:rFonts w:asciiTheme="majorHAnsi" w:cstheme="majorBidi" w:eastAsiaTheme="majorEastAsia" w:hAnsiTheme="majorHAnsi"/>
-      <w:color w:themeColor="accent1" w:themeShade="BF" w:val="0F4761"/>
+      <w:color w:themeColor="accent1" w:themeShade="BF" w:val="000000"/>
       <w:sz w:val="40"/>
       <w:szCs w:val="40"/>
     </w:rPr>
@@ -15441,7 +15361,7 @@
     <w:rsid w:val="00A10FD9"/>
     <w:rPr>
       <w:rFonts w:asciiTheme="majorHAnsi" w:cstheme="majorBidi" w:eastAsiaTheme="majorEastAsia" w:hAnsiTheme="majorHAnsi"/>
-      <w:color w:themeColor="accent1" w:themeShade="BF" w:val="0F4761"/>
+      <w:color w:themeColor="accent1" w:themeShade="BF" w:val="000000"/>
       <w:sz w:val="32"/>
       <w:szCs w:val="32"/>
     </w:rPr>
@@ -15455,7 +15375,7 @@
     <w:rsid w:val="00A10FD9"/>
     <w:rPr>
       <w:rFonts w:cstheme="majorBidi" w:eastAsiaTheme="majorEastAsia"/>
-      <w:color w:themeColor="accent1" w:themeShade="BF" w:val="0F4761"/>
+      <w:color w:themeColor="accent1" w:themeShade="BF" w:val="000000"/>
       <w:sz w:val="28"/>
       <w:szCs w:val="28"/>
     </w:rPr>
@@ -15471,7 +15391,7 @@
       <w:rFonts w:cstheme="majorBidi" w:eastAsiaTheme="majorEastAsia"/>
       <w:i/>
       <w:iCs/>
-      <w:color w:themeColor="accent1" w:themeShade="BF" w:val="0F4761"/>
+      <w:color w:themeColor="accent1" w:themeShade="BF" w:val="000000"/>
     </w:rPr>
   </w:style>
   <w:style w:customStyle="1" w:styleId="Heading5Char" w:type="character">
@@ -15483,7 +15403,7 @@
     <w:rsid w:val="00A10FD9"/>
     <w:rPr>
       <w:rFonts w:cstheme="majorBidi" w:eastAsiaTheme="majorEastAsia"/>
-      <w:color w:themeColor="accent1" w:themeShade="BF" w:val="0F4761"/>
+      <w:color w:themeColor="accent1" w:themeShade="BF" w:val="000000"/>
     </w:rPr>
   </w:style>
   <w:style w:customStyle="1" w:styleId="Heading6Char" w:type="character">
@@ -15497,7 +15417,7 @@
       <w:rFonts w:cstheme="majorBidi" w:eastAsiaTheme="majorEastAsia"/>
       <w:i/>
       <w:iCs/>
-      <w:color w:themeColor="text1" w:themeTint="A6" w:val="595959"/>
+      <w:color w:themeColor="text1" w:themeTint="A6" w:val="000000"/>
     </w:rPr>
   </w:style>
   <w:style w:customStyle="1" w:styleId="Heading7Char" w:type="character">
@@ -15509,7 +15429,7 @@
     <w:rsid w:val="00A10FD9"/>
     <w:rPr>
       <w:rFonts w:cstheme="majorBidi" w:eastAsiaTheme="majorEastAsia"/>
-      <w:color w:themeColor="text1" w:themeTint="A6" w:val="595959"/>
+      <w:color w:themeColor="text1" w:themeTint="A6" w:val="000000"/>
     </w:rPr>
   </w:style>
   <w:style w:customStyle="1" w:styleId="Heading8Char" w:type="character">
@@ -15523,7 +15443,7 @@
       <w:rFonts w:cstheme="majorBidi" w:eastAsiaTheme="majorEastAsia"/>
       <w:i/>
       <w:iCs/>
-      <w:color w:themeColor="text1" w:themeTint="D8" w:val="272727"/>
+      <w:color w:themeColor="text1" w:themeTint="D8" w:val="000000"/>
     </w:rPr>
   </w:style>
   <w:style w:customStyle="1" w:styleId="Heading9Char" w:type="character">
@@ -15535,7 +15455,7 @@
     <w:rsid w:val="00A10FD9"/>
     <w:rPr>
       <w:rFonts w:cstheme="majorBidi" w:eastAsiaTheme="majorEastAsia"/>
-      <w:color w:themeColor="text1" w:themeTint="D8" w:val="272727"/>
+      <w:color w:themeColor="text1" w:themeTint="D8" w:val="000000"/>
     </w:rPr>
   </w:style>
   <w:style w:styleId="BlockText" w:type="paragraph">

</xml_diff>